<commit_message>
feat: Implementar la funcionalidad de convertir docx a pdf y permitir al usuario descargarlo mediante el controller de nombramiento
</commit_message>
<xml_diff>
--- a/src/WebApp.Web/wwwroot/Templates/Nombramiento template.docx
+++ b/src/WebApp.Web/wwwroot/Templates/Nombramiento template.docx
@@ -345,11 +345,6 @@
     </w:p>
     <w:p>
       <w:pPr>
-        <w:pStyle w:val="Prrafodelista"/>
-        <w:numPr>
-          <w:ilvl w:val="0"/>
-          <w:numId w:val="6"/>
-        </w:numPr>
         <w:spacing w:line="276" w:lineRule="auto"/>
         <w:jc w:val="both"/>
         <w:rPr>
@@ -488,160 +483,7 @@
     <w:p>
       <w:pPr>
         <w:spacing w:line="276" w:lineRule="auto"/>
-        <w:jc w:val="both"/>
-        <w:rPr>
-          <w:rFonts w:ascii="Arial" w:hAnsi="Arial" w:cs="Arial"/>
-        </w:rPr>
-      </w:pPr>
-    </w:p>
-    <w:p>
-      <w:pPr>
-        <w:spacing w:line="276" w:lineRule="auto"/>
-        <w:jc w:val="both"/>
-        <w:rPr>
-          <w:rFonts w:ascii="Arial" w:hAnsi="Arial" w:cs="Arial"/>
-        </w:rPr>
-      </w:pPr>
-    </w:p>
-    <w:p>
-      <w:pPr>
-        <w:spacing w:line="276" w:lineRule="auto"/>
-        <w:jc w:val="both"/>
-        <w:rPr>
-          <w:rFonts w:ascii="Arial" w:hAnsi="Arial" w:cs="Arial"/>
-        </w:rPr>
-      </w:pPr>
-    </w:p>
-    <w:p>
-      <w:pPr>
-        <w:spacing w:line="276" w:lineRule="auto"/>
-        <w:jc w:val="both"/>
-        <w:rPr>
-          <w:rFonts w:ascii="Arial" w:hAnsi="Arial" w:cs="Arial"/>
-        </w:rPr>
-      </w:pPr>
-    </w:p>
-    <w:p>
-      <w:pPr>
-        <w:spacing w:line="276" w:lineRule="auto"/>
-        <w:jc w:val="both"/>
-        <w:rPr>
-          <w:rFonts w:ascii="Arial" w:hAnsi="Arial" w:cs="Arial"/>
-        </w:rPr>
-      </w:pPr>
-    </w:p>
-    <w:p>
-      <w:pPr>
-        <w:spacing w:line="276" w:lineRule="auto"/>
-        <w:jc w:val="both"/>
-        <w:rPr>
-          <w:rFonts w:ascii="Arial" w:hAnsi="Arial" w:cs="Arial"/>
-        </w:rPr>
-      </w:pPr>
-    </w:p>
-    <w:p>
-      <w:pPr>
-        <w:spacing w:line="276" w:lineRule="auto"/>
-        <w:jc w:val="both"/>
-        <w:rPr>
-          <w:rFonts w:ascii="Arial" w:hAnsi="Arial" w:cs="Arial"/>
-        </w:rPr>
-      </w:pPr>
-    </w:p>
-    <w:p>
-      <w:pPr>
-        <w:spacing w:line="276" w:lineRule="auto"/>
-        <w:jc w:val="both"/>
-        <w:rPr>
-          <w:rFonts w:ascii="Arial" w:hAnsi="Arial" w:cs="Arial"/>
-        </w:rPr>
-      </w:pPr>
-    </w:p>
-    <w:p>
-      <w:pPr>
-        <w:spacing w:line="276" w:lineRule="auto"/>
-        <w:jc w:val="both"/>
-        <w:rPr>
-          <w:rFonts w:ascii="Arial" w:hAnsi="Arial" w:cs="Arial"/>
-        </w:rPr>
-      </w:pPr>
-    </w:p>
-    <w:p>
-      <w:pPr>
-        <w:spacing w:line="276" w:lineRule="auto"/>
-        <w:jc w:val="both"/>
-        <w:rPr>
-          <w:rFonts w:ascii="Arial" w:hAnsi="Arial" w:cs="Arial"/>
-        </w:rPr>
-      </w:pPr>
-    </w:p>
-    <w:p>
-      <w:pPr>
-        <w:spacing w:line="276" w:lineRule="auto"/>
-        <w:jc w:val="both"/>
-        <w:rPr>
-          <w:rFonts w:ascii="Arial" w:hAnsi="Arial" w:cs="Arial"/>
-        </w:rPr>
-      </w:pPr>
-    </w:p>
-    <w:p>
-      <w:pPr>
-        <w:spacing w:line="276" w:lineRule="auto"/>
-        <w:jc w:val="both"/>
-        <w:rPr>
-          <w:rFonts w:ascii="Arial" w:hAnsi="Arial" w:cs="Arial"/>
-        </w:rPr>
-      </w:pPr>
-    </w:p>
-    <w:p>
-      <w:pPr>
-        <w:spacing w:line="276" w:lineRule="auto"/>
-        <w:jc w:val="both"/>
-        <w:rPr>
-          <w:rFonts w:ascii="Arial" w:hAnsi="Arial" w:cs="Arial"/>
-        </w:rPr>
-      </w:pPr>
-    </w:p>
-    <w:p>
-      <w:pPr>
-        <w:spacing w:line="276" w:lineRule="auto"/>
-        <w:jc w:val="both"/>
-        <w:rPr>
-          <w:rFonts w:ascii="Arial" w:hAnsi="Arial" w:cs="Arial"/>
-        </w:rPr>
-      </w:pPr>
-    </w:p>
-    <w:p>
-      <w:pPr>
-        <w:spacing w:line="276" w:lineRule="auto"/>
-        <w:jc w:val="both"/>
-        <w:rPr>
-          <w:rFonts w:ascii="Arial" w:hAnsi="Arial" w:cs="Arial"/>
-        </w:rPr>
-      </w:pPr>
-    </w:p>
-    <w:p>
-      <w:pPr>
-        <w:spacing w:line="276" w:lineRule="auto"/>
-        <w:jc w:val="both"/>
-        <w:rPr>
-          <w:rFonts w:ascii="Arial" w:hAnsi="Arial" w:cs="Arial"/>
-        </w:rPr>
-      </w:pPr>
-    </w:p>
-    <w:p>
-      <w:pPr>
-        <w:spacing w:line="276" w:lineRule="auto"/>
-        <w:jc w:val="both"/>
-        <w:rPr>
-          <w:rFonts w:ascii="Arial" w:hAnsi="Arial" w:cs="Arial"/>
-        </w:rPr>
-      </w:pPr>
-    </w:p>
-    <w:p>
-      <w:pPr>
-        <w:spacing w:line="276" w:lineRule="auto"/>
-        <w:jc w:val="both"/>
+        <w:jc w:val="right"/>
         <w:rPr>
           <w:rFonts w:ascii="Arial" w:hAnsi="Arial" w:cs="Arial"/>
           <w:color w:val="808080" w:themeColor="background1" w:themeShade="80"/>
@@ -675,6 +517,130 @@
           <w:szCs w:val="20"/>
         </w:rPr>
         <w:t>{{EMITIDO_POR}}</w:t>
+      </w:r>
+    </w:p>
+    <w:p>
+      <w:pPr>
+        <w:spacing w:line="276" w:lineRule="auto"/>
+        <w:jc w:val="both"/>
+        <w:rPr>
+          <w:rFonts w:ascii="Arial" w:hAnsi="Arial" w:cs="Arial"/>
+        </w:rPr>
+      </w:pPr>
+    </w:p>
+    <w:p>
+      <w:pPr>
+        <w:spacing w:line="276" w:lineRule="auto"/>
+        <w:jc w:val="both"/>
+        <w:rPr>
+          <w:rFonts w:ascii="Arial" w:hAnsi="Arial" w:cs="Arial"/>
+        </w:rPr>
+      </w:pPr>
+    </w:p>
+    <w:p>
+      <w:pPr>
+        <w:spacing w:line="276" w:lineRule="auto"/>
+        <w:jc w:val="both"/>
+        <w:rPr>
+          <w:rFonts w:ascii="Arial" w:hAnsi="Arial" w:cs="Arial"/>
+        </w:rPr>
+      </w:pPr>
+    </w:p>
+    <w:p>
+      <w:pPr>
+        <w:spacing w:line="276" w:lineRule="auto"/>
+        <w:jc w:val="both"/>
+        <w:rPr>
+          <w:rFonts w:ascii="Arial" w:hAnsi="Arial" w:cs="Arial"/>
+        </w:rPr>
+      </w:pPr>
+    </w:p>
+    <w:p>
+      <w:pPr>
+        <w:spacing w:line="276" w:lineRule="auto"/>
+        <w:jc w:val="both"/>
+        <w:rPr>
+          <w:rFonts w:ascii="Arial" w:hAnsi="Arial" w:cs="Arial"/>
+        </w:rPr>
+      </w:pPr>
+    </w:p>
+    <w:p>
+      <w:pPr>
+        <w:spacing w:line="276" w:lineRule="auto"/>
+        <w:jc w:val="both"/>
+        <w:rPr>
+          <w:rFonts w:ascii="Arial" w:hAnsi="Arial" w:cs="Arial"/>
+        </w:rPr>
+      </w:pPr>
+      <w:r>
+        <w:rPr>
+          <w:rFonts w:ascii="Arial" w:hAnsi="Arial" w:cs="Arial"/>
+        </w:rPr>
+        <w:t>________________________</w:t>
+      </w:r>
+      <w:r>
+        <w:rPr>
+          <w:rFonts w:ascii="Arial" w:hAnsi="Arial" w:cs="Arial"/>
+        </w:rPr>
+        <w:t>__</w:t>
+      </w:r>
+      <w:r>
+        <w:rPr>
+          <w:rFonts w:ascii="Arial" w:hAnsi="Arial" w:cs="Arial"/>
+        </w:rPr>
+        <w:tab/>
+        <w:t xml:space="preserve">   </w:t>
+      </w:r>
+      <w:r>
+        <w:rPr>
+          <w:rFonts w:ascii="Arial" w:hAnsi="Arial" w:cs="Arial"/>
+        </w:rPr>
+        <w:t xml:space="preserve">         </w:t>
+      </w:r>
+      <w:r>
+        <w:rPr>
+          <w:rFonts w:ascii="Arial" w:hAnsi="Arial" w:cs="Arial"/>
+        </w:rPr>
+        <w:t xml:space="preserve">   Vo.Bo.</w:t>
+      </w:r>
+      <w:r>
+        <w:rPr>
+          <w:rFonts w:ascii="Arial" w:hAnsi="Arial" w:cs="Arial"/>
+        </w:rPr>
+        <w:t xml:space="preserve"> </w:t>
+      </w:r>
+      <w:r>
+        <w:rPr>
+          <w:rFonts w:ascii="Arial" w:hAnsi="Arial" w:cs="Arial"/>
+        </w:rPr>
+        <w:t>________________________</w:t>
+      </w:r>
+      <w:r>
+        <w:rPr>
+          <w:rFonts w:ascii="Arial" w:hAnsi="Arial" w:cs="Arial"/>
+        </w:rPr>
+        <w:tab/>
+      </w:r>
+    </w:p>
+    <w:p>
+      <w:pPr>
+        <w:spacing w:line="276" w:lineRule="auto"/>
+        <w:jc w:val="both"/>
+        <w:rPr>
+          <w:rFonts w:ascii="Arial" w:hAnsi="Arial" w:cs="Arial"/>
+          <w:sz w:val="20"/>
+          <w:szCs w:val="20"/>
+        </w:rPr>
+      </w:pPr>
+      <w:r>
+        <w:rPr>
+          <w:rFonts w:ascii="Arial" w:hAnsi="Arial" w:cs="Arial"/>
+          <w:b/>
+          <w:bCs/>
+          <w:sz w:val="20"/>
+          <w:szCs w:val="20"/>
+        </w:rPr>
+        <w:t>{{NOMBRE_USUARIO}}</w:t>
       </w:r>
     </w:p>
     <w:sectPr>
@@ -755,7 +721,7 @@
                       <a:effectLst/>
                       <a:extLst>
                         <a:ext uri="{C572A759-6A51-4108-AA02-DFA0A04FC94B}">
-                          <ma14:wrappingTextBoxFlag xmlns:ma14="http://schemas.microsoft.com/office/mac/drawingml/2011/main" xmlns:w="http://schemas.openxmlformats.org/wordprocessingml/2006/main" xmlns:w10="urn:schemas-microsoft-com:office:word" xmlns:v="urn:schemas-microsoft-com:vml" xmlns:o="urn:schemas-microsoft-com:office:office" xmlns:mv="urn:schemas-microsoft-com:mac:vml" xmlns:mo="http://schemas.microsoft.com/office/mac/office/2008/main" xmlns=""/>
+                          <ma14:wrappingTextBoxFlag xmlns="" xmlns:mo="http://schemas.microsoft.com/office/mac/office/2008/main" xmlns:mv="urn:schemas-microsoft-com:mac:vml" xmlns:o="urn:schemas-microsoft-com:office:office" xmlns:v="urn:schemas-microsoft-com:vml" xmlns:w10="urn:schemas-microsoft-com:office:word" xmlns:w="http://schemas.openxmlformats.org/wordprocessingml/2006/main" xmlns:ma14="http://schemas.microsoft.com/office/mac/drawingml/2011/main"/>
                         </a:ext>
                       </a:extLst>
                     </wps:spPr>
@@ -1123,7 +1089,7 @@
                       <a:effectLst/>
                       <a:extLst>
                         <a:ext uri="{C572A759-6A51-4108-AA02-DFA0A04FC94B}">
-                          <ma14:wrappingTextBoxFlag xmlns:ma14="http://schemas.microsoft.com/office/mac/drawingml/2011/main" xmlns:w="http://schemas.openxmlformats.org/wordprocessingml/2006/main" xmlns:w10="urn:schemas-microsoft-com:office:word" xmlns:v="urn:schemas-microsoft-com:vml" xmlns:o="urn:schemas-microsoft-com:office:office" xmlns:mv="urn:schemas-microsoft-com:mac:vml" xmlns:mo="http://schemas.microsoft.com/office/mac/office/2008/main" xmlns=""/>
+                          <ma14:wrappingTextBoxFlag xmlns="" xmlns:mo="http://schemas.microsoft.com/office/mac/office/2008/main" xmlns:mv="urn:schemas-microsoft-com:mac:vml" xmlns:o="urn:schemas-microsoft-com:office:office" xmlns:v="urn:schemas-microsoft-com:vml" xmlns:w10="urn:schemas-microsoft-com:office:word" xmlns:w="http://schemas.openxmlformats.org/wordprocessingml/2006/main" xmlns:ma14="http://schemas.microsoft.com/office/mac/drawingml/2011/main"/>
                         </a:ext>
                       </a:extLst>
                     </wps:spPr>

</xml_diff>

<commit_message>
feat: Agregar método estático Crear en ComisionDestino y permitir agregar destinos sin vehículo en Comision
</commit_message>
<xml_diff>
--- a/src/WebApp.Web/wwwroot/Templates/Nombramiento template.docx
+++ b/src/WebApp.Web/wwwroot/Templates/Nombramiento template.docx
@@ -57,435 +57,6 @@
         <w:jc w:val="center"/>
         <w:rPr>
           <w:rFonts w:ascii="Arial" w:hAnsi="Arial" w:cs="Arial"/>
-          <w:lang w:val="es-MX"/>
-        </w:rPr>
-      </w:pPr>
-    </w:p>
-    <w:p>
-      <w:pPr>
-        <w:spacing w:line="276" w:lineRule="auto"/>
-        <w:jc w:val="both"/>
-        <w:rPr>
-          <w:rFonts w:ascii="Arial" w:hAnsi="Arial" w:cs="Arial"/>
-        </w:rPr>
-      </w:pPr>
-      <w:r>
-        <w:rPr>
-          <w:rFonts w:ascii="Arial" w:hAnsi="Arial" w:cs="Arial"/>
-        </w:rPr>
-        <w:t xml:space="preserve">En la ciudad de </w:t>
-      </w:r>
-      <w:r>
-        <w:rPr>
-          <w:rFonts w:ascii="Arial" w:hAnsi="Arial" w:cs="Arial"/>
-          <w:b/>
-          <w:bCs/>
-        </w:rPr>
-        <w:t>Guatemala</w:t>
-      </w:r>
-      <w:r>
-        <w:rPr>
-          <w:rFonts w:ascii="Arial" w:hAnsi="Arial" w:cs="Arial"/>
-        </w:rPr>
-        <w:t>,</w:t>
-      </w:r>
-      <w:r>
-        <w:rPr>
-          <w:rFonts w:ascii="Arial" w:hAnsi="Arial" w:cs="Arial"/>
-        </w:rPr>
-        <w:t xml:space="preserve"> el día</w:t>
-      </w:r>
-      <w:r>
-        <w:rPr>
-          <w:rFonts w:ascii="Arial" w:hAnsi="Arial" w:cs="Arial"/>
-        </w:rPr>
-        <w:t xml:space="preserve"> </w:t>
-      </w:r>
-      <w:r>
-        <w:rPr>
-          <w:rFonts w:ascii="Arial" w:hAnsi="Arial" w:cs="Arial"/>
-        </w:rPr>
-        <w:t>hoy</w:t>
-      </w:r>
-      <w:r>
-        <w:rPr>
-          <w:rFonts w:ascii="Arial" w:hAnsi="Arial" w:cs="Arial"/>
-        </w:rPr>
-        <w:t xml:space="preserve"> </w:t>
-      </w:r>
-      <w:r>
-        <w:rPr>
-          <w:rFonts w:ascii="Arial" w:hAnsi="Arial" w:cs="Arial"/>
-          <w:b/>
-          <w:bCs/>
-        </w:rPr>
-        <w:t>{{FECHA_NOMBRAMIENTO}}</w:t>
-      </w:r>
-      <w:r>
-        <w:rPr>
-          <w:rFonts w:ascii="Arial" w:hAnsi="Arial" w:cs="Arial"/>
-          <w:b/>
-          <w:bCs/>
-        </w:rPr>
-        <w:t xml:space="preserve">, </w:t>
-      </w:r>
-      <w:r>
-        <w:rPr>
-          <w:rFonts w:ascii="Arial" w:hAnsi="Arial" w:cs="Arial"/>
-        </w:rPr>
-        <w:t xml:space="preserve">se extiende el presente </w:t>
-      </w:r>
-      <w:r>
-        <w:rPr>
-          <w:rFonts w:ascii="Arial" w:hAnsi="Arial" w:cs="Arial"/>
-          <w:b/>
-          <w:bCs/>
-        </w:rPr>
-        <w:t>nombramiento</w:t>
-      </w:r>
-      <w:r>
-        <w:rPr>
-          <w:rFonts w:ascii="Arial" w:hAnsi="Arial" w:cs="Arial"/>
-          <w:b/>
-          <w:bCs/>
-        </w:rPr>
-        <w:t xml:space="preserve"> de comisión</w:t>
-      </w:r>
-      <w:r>
-        <w:rPr>
-          <w:rFonts w:ascii="Arial" w:hAnsi="Arial" w:cs="Arial"/>
-        </w:rPr>
-        <w:t xml:space="preserve"> a favor de</w:t>
-      </w:r>
-      <w:r>
-        <w:rPr>
-          <w:rFonts w:ascii="Arial" w:hAnsi="Arial" w:cs="Arial"/>
-        </w:rPr>
-        <w:t>:</w:t>
-      </w:r>
-      <w:r>
-        <w:rPr>
-          <w:rFonts w:ascii="Arial" w:hAnsi="Arial" w:cs="Arial"/>
-        </w:rPr>
-        <w:t xml:space="preserve"> </w:t>
-      </w:r>
-      <w:r>
-        <w:rPr>
-          <w:rFonts w:ascii="Arial" w:hAnsi="Arial" w:cs="Arial"/>
-          <w:b/>
-          <w:bCs/>
-        </w:rPr>
-        <w:t>{{NOMBRE_USUARIO}}</w:t>
-      </w:r>
-      <w:r>
-        <w:rPr>
-          <w:rFonts w:ascii="Arial" w:hAnsi="Arial" w:cs="Arial"/>
-        </w:rPr>
-        <w:t xml:space="preserve">, </w:t>
-      </w:r>
-      <w:r>
-        <w:rPr>
-          <w:rFonts w:ascii="Arial" w:hAnsi="Arial" w:cs="Arial"/>
-        </w:rPr>
-        <w:t>quien desempeña el cargo de</w:t>
-      </w:r>
-      <w:r>
-        <w:rPr>
-          <w:rFonts w:ascii="Arial" w:hAnsi="Arial" w:cs="Arial"/>
-        </w:rPr>
-        <w:t>:</w:t>
-      </w:r>
-      <w:r>
-        <w:rPr>
-          <w:rFonts w:ascii="Arial" w:hAnsi="Arial" w:cs="Arial"/>
-        </w:rPr>
-        <w:t xml:space="preserve"> </w:t>
-      </w:r>
-      <w:r>
-        <w:rPr>
-          <w:rFonts w:ascii="Arial" w:hAnsi="Arial" w:cs="Arial"/>
-          <w:b/>
-          <w:bCs/>
-        </w:rPr>
-        <w:t>{{PUESTO}}</w:t>
-      </w:r>
-      <w:r>
-        <w:rPr>
-          <w:rFonts w:ascii="Arial" w:hAnsi="Arial" w:cs="Arial"/>
-        </w:rPr>
-        <w:t>.</w:t>
-      </w:r>
-    </w:p>
-    <w:p>
-      <w:pPr>
-        <w:spacing w:line="276" w:lineRule="auto"/>
-        <w:jc w:val="both"/>
-        <w:rPr>
-          <w:rFonts w:ascii="Arial" w:hAnsi="Arial" w:cs="Arial"/>
-        </w:rPr>
-      </w:pPr>
-    </w:p>
-    <w:p>
-      <w:pPr>
-        <w:spacing w:line="276" w:lineRule="auto"/>
-        <w:jc w:val="both"/>
-        <w:rPr>
-          <w:rFonts w:ascii="Arial" w:hAnsi="Arial" w:cs="Arial"/>
-        </w:rPr>
-      </w:pPr>
-      <w:r>
-        <w:rPr>
-          <w:rFonts w:ascii="Arial" w:hAnsi="Arial" w:cs="Arial"/>
-        </w:rPr>
-        <w:t>Por este medio, se le informa que ha sido designado para realizar la comisión</w:t>
-      </w:r>
-      <w:r>
-        <w:rPr>
-          <w:rFonts w:ascii="Arial" w:hAnsi="Arial" w:cs="Arial"/>
-        </w:rPr>
-        <w:t xml:space="preserve"> </w:t>
-      </w:r>
-      <w:r>
-        <w:rPr>
-          <w:rFonts w:ascii="Arial" w:hAnsi="Arial" w:cs="Arial"/>
-        </w:rPr>
-        <w:t xml:space="preserve">con el propósito </w:t>
-      </w:r>
-      <w:r>
-        <w:rPr>
-          <w:rFonts w:ascii="Arial" w:hAnsi="Arial" w:cs="Arial"/>
-        </w:rPr>
-        <w:t>de:</w:t>
-      </w:r>
-    </w:p>
-    <w:p>
-      <w:pPr>
-        <w:spacing w:line="276" w:lineRule="auto"/>
-        <w:jc w:val="both"/>
-        <w:rPr>
-          <w:rFonts w:ascii="Arial" w:hAnsi="Arial" w:cs="Arial"/>
-        </w:rPr>
-      </w:pPr>
-    </w:p>
-    <w:p>
-      <w:pPr>
-        <w:spacing w:line="276" w:lineRule="auto"/>
-        <w:jc w:val="both"/>
-        <w:rPr>
-          <w:rFonts w:ascii="Arial" w:hAnsi="Arial" w:cs="Arial"/>
-          <w:b/>
-          <w:bCs/>
-        </w:rPr>
-      </w:pPr>
-      <w:r>
-        <w:rPr>
-          <w:rFonts w:ascii="Arial" w:hAnsi="Arial" w:cs="Arial"/>
-          <w:b/>
-          <w:bCs/>
-        </w:rPr>
-        <w:t>{{PROPOSITO}}</w:t>
-      </w:r>
-    </w:p>
-    <w:p>
-      <w:pPr>
-        <w:spacing w:line="276" w:lineRule="auto"/>
-        <w:jc w:val="both"/>
-        <w:rPr>
-          <w:rFonts w:ascii="Arial" w:hAnsi="Arial" w:cs="Arial"/>
-        </w:rPr>
-      </w:pPr>
-    </w:p>
-    <w:p>
-      <w:pPr>
-        <w:spacing w:line="276" w:lineRule="auto"/>
-        <w:jc w:val="both"/>
-        <w:rPr>
-          <w:rFonts w:ascii="Arial" w:hAnsi="Arial" w:cs="Arial"/>
-        </w:rPr>
-      </w:pPr>
-      <w:r>
-        <w:rPr>
-          <w:rFonts w:ascii="Arial" w:hAnsi="Arial" w:cs="Arial"/>
-        </w:rPr>
-        <w:t>Realizar</w:t>
-      </w:r>
-      <w:r>
-        <w:rPr>
-          <w:rFonts w:ascii="Arial" w:hAnsi="Arial" w:cs="Arial"/>
-        </w:rPr>
-        <w:t xml:space="preserve"> las diligencias que corresponden en cuanto a la designación y los procesos requeridos, en </w:t>
-      </w:r>
-      <w:r>
-        <w:rPr>
-          <w:rFonts w:ascii="Arial" w:hAnsi="Arial" w:cs="Arial"/>
-        </w:rPr>
-        <w:t xml:space="preserve">el/los departamento(s) </w:t>
-      </w:r>
-      <w:r>
-        <w:rPr>
-          <w:rFonts w:ascii="Arial" w:hAnsi="Arial" w:cs="Arial"/>
-        </w:rPr>
-        <w:t>de</w:t>
-      </w:r>
-      <w:r>
-        <w:rPr>
-          <w:rFonts w:ascii="Arial" w:hAnsi="Arial" w:cs="Arial"/>
-        </w:rPr>
-        <w:t>:</w:t>
-      </w:r>
-    </w:p>
-    <w:p>
-      <w:pPr>
-        <w:spacing w:line="276" w:lineRule="auto"/>
-        <w:jc w:val="both"/>
-        <w:rPr>
-          <w:rFonts w:ascii="Arial" w:hAnsi="Arial" w:cs="Arial"/>
-        </w:rPr>
-      </w:pPr>
-    </w:p>
-    <w:p>
-      <w:pPr>
-        <w:spacing w:line="276" w:lineRule="auto"/>
-        <w:jc w:val="both"/>
-        <w:rPr>
-          <w:rFonts w:ascii="Arial" w:hAnsi="Arial" w:cs="Arial"/>
-          <w:b/>
-          <w:bCs/>
-        </w:rPr>
-      </w:pPr>
-      <w:r>
-        <w:rPr>
-          <w:rFonts w:ascii="Arial" w:hAnsi="Arial" w:cs="Arial"/>
-          <w:b/>
-          <w:bCs/>
-        </w:rPr>
-        <w:t>{{DESTINOS}}</w:t>
-      </w:r>
-    </w:p>
-    <w:p>
-      <w:pPr>
-        <w:spacing w:line="276" w:lineRule="auto"/>
-        <w:jc w:val="both"/>
-        <w:rPr>
-          <w:rFonts w:ascii="Arial" w:hAnsi="Arial" w:cs="Arial"/>
-        </w:rPr>
-      </w:pPr>
-    </w:p>
-    <w:p>
-      <w:pPr>
-        <w:spacing w:line="276" w:lineRule="auto"/>
-        <w:jc w:val="both"/>
-        <w:rPr>
-          <w:rFonts w:ascii="Arial" w:hAnsi="Arial" w:cs="Arial"/>
-        </w:rPr>
-      </w:pPr>
-      <w:r>
-        <w:rPr>
-          <w:rFonts w:ascii="Arial" w:hAnsi="Arial" w:cs="Arial"/>
-        </w:rPr>
-        <w:t>La vigencia de la comisión será</w:t>
-      </w:r>
-      <w:r>
-        <w:rPr>
-          <w:rFonts w:ascii="Arial" w:hAnsi="Arial" w:cs="Arial"/>
-        </w:rPr>
-        <w:t xml:space="preserve"> </w:t>
-      </w:r>
-      <w:r>
-        <w:rPr>
-          <w:rFonts w:ascii="Arial" w:hAnsi="Arial" w:cs="Arial"/>
-        </w:rPr>
-        <w:t>del</w:t>
-      </w:r>
-      <w:r>
-        <w:rPr>
-          <w:rFonts w:ascii="Arial" w:hAnsi="Arial" w:cs="Arial"/>
-        </w:rPr>
-        <w:t xml:space="preserve">: </w:t>
-      </w:r>
-      <w:r>
-        <w:rPr>
-          <w:rFonts w:ascii="Arial" w:hAnsi="Arial" w:cs="Arial"/>
-          <w:b/>
-          <w:bCs/>
-        </w:rPr>
-        <w:t xml:space="preserve">{{FECHA_SALIDA}} </w:t>
-      </w:r>
-      <w:r>
-        <w:rPr>
-          <w:rFonts w:ascii="Arial" w:hAnsi="Arial" w:cs="Arial"/>
-        </w:rPr>
-        <w:t>al</w:t>
-      </w:r>
-      <w:r>
-        <w:rPr>
-          <w:rFonts w:ascii="Arial" w:hAnsi="Arial" w:cs="Arial"/>
-        </w:rPr>
-        <w:t xml:space="preserve">: </w:t>
-      </w:r>
-      <w:r>
-        <w:rPr>
-          <w:rFonts w:ascii="Arial" w:hAnsi="Arial" w:cs="Arial"/>
-          <w:b/>
-          <w:bCs/>
-        </w:rPr>
-        <w:t>{{FECHA_REGRESO}}</w:t>
-      </w:r>
-      <w:r>
-        <w:rPr>
-          <w:rFonts w:ascii="Arial" w:hAnsi="Arial" w:cs="Arial"/>
-        </w:rPr>
-        <w:t>.</w:t>
-      </w:r>
-      <w:r>
-        <w:rPr>
-          <w:rFonts w:ascii="Arial" w:hAnsi="Arial" w:cs="Arial"/>
-        </w:rPr>
-        <w:t xml:space="preserve"> </w:t>
-      </w:r>
-      <w:r>
-        <w:rPr>
-          <w:rFonts w:ascii="Arial" w:hAnsi="Arial" w:cs="Arial"/>
-        </w:rPr>
-        <w:t>Deberá</w:t>
-      </w:r>
-      <w:r>
-        <w:rPr>
-          <w:rFonts w:ascii="Arial" w:hAnsi="Arial" w:cs="Arial"/>
-        </w:rPr>
-        <w:t xml:space="preserve"> </w:t>
-      </w:r>
-      <w:r>
-        <w:rPr>
-          <w:rFonts w:ascii="Arial" w:hAnsi="Arial" w:cs="Arial"/>
-        </w:rPr>
-        <w:t xml:space="preserve">presentar los informes </w:t>
-      </w:r>
-      <w:r>
-        <w:rPr>
-          <w:rFonts w:ascii="Arial" w:hAnsi="Arial" w:cs="Arial"/>
-        </w:rPr>
-        <w:t>correspondientes</w:t>
-      </w:r>
-      <w:r>
-        <w:rPr>
-          <w:rFonts w:ascii="Arial" w:hAnsi="Arial" w:cs="Arial"/>
-        </w:rPr>
-        <w:t xml:space="preserve"> al concluir la actividad</w:t>
-      </w:r>
-      <w:r>
-        <w:rPr>
-          <w:rFonts w:ascii="Arial" w:hAnsi="Arial" w:cs="Arial"/>
-        </w:rPr>
-        <w:t>.</w:t>
-      </w:r>
-    </w:p>
-    <w:p>
-      <w:pPr>
-        <w:spacing w:line="276" w:lineRule="auto"/>
-        <w:jc w:val="right"/>
-        <w:rPr>
-          <w:rFonts w:ascii="Arial" w:hAnsi="Arial" w:cs="Arial"/>
           <w:color w:val="808080" w:themeColor="background1" w:themeShade="80"/>
           <w:sz w:val="20"/>
           <w:szCs w:val="20"/>
@@ -517,6 +88,434 @@
           <w:szCs w:val="20"/>
         </w:rPr>
         <w:t>{{EMITIDO_POR}}</w:t>
+      </w:r>
+    </w:p>
+    <w:p>
+      <w:pPr>
+        <w:spacing w:line="276" w:lineRule="auto"/>
+        <w:jc w:val="center"/>
+        <w:rPr>
+          <w:rFonts w:ascii="Arial" w:hAnsi="Arial" w:cs="Arial"/>
+        </w:rPr>
+      </w:pPr>
+    </w:p>
+    <w:p>
+      <w:pPr>
+        <w:spacing w:line="276" w:lineRule="auto"/>
+        <w:jc w:val="both"/>
+        <w:rPr>
+          <w:rFonts w:ascii="Arial" w:hAnsi="Arial" w:cs="Arial"/>
+        </w:rPr>
+      </w:pPr>
+      <w:r>
+        <w:rPr>
+          <w:rFonts w:ascii="Arial" w:hAnsi="Arial" w:cs="Arial"/>
+        </w:rPr>
+        <w:t xml:space="preserve">En la ciudad de </w:t>
+      </w:r>
+      <w:r>
+        <w:rPr>
+          <w:rFonts w:ascii="Arial" w:hAnsi="Arial" w:cs="Arial"/>
+          <w:b/>
+          <w:bCs/>
+        </w:rPr>
+        <w:t>Guatemala</w:t>
+      </w:r>
+      <w:r>
+        <w:rPr>
+          <w:rFonts w:ascii="Arial" w:hAnsi="Arial" w:cs="Arial"/>
+        </w:rPr>
+        <w:t>,</w:t>
+      </w:r>
+      <w:r>
+        <w:rPr>
+          <w:rFonts w:ascii="Arial" w:hAnsi="Arial" w:cs="Arial"/>
+        </w:rPr>
+        <w:t xml:space="preserve"> el día</w:t>
+      </w:r>
+      <w:r>
+        <w:rPr>
+          <w:rFonts w:ascii="Arial" w:hAnsi="Arial" w:cs="Arial"/>
+        </w:rPr>
+        <w:t xml:space="preserve"> </w:t>
+      </w:r>
+      <w:r>
+        <w:rPr>
+          <w:rFonts w:ascii="Arial" w:hAnsi="Arial" w:cs="Arial"/>
+        </w:rPr>
+        <w:t>hoy</w:t>
+      </w:r>
+      <w:r>
+        <w:rPr>
+          <w:rFonts w:ascii="Arial" w:hAnsi="Arial" w:cs="Arial"/>
+        </w:rPr>
+        <w:t xml:space="preserve"> </w:t>
+      </w:r>
+      <w:r>
+        <w:rPr>
+          <w:rFonts w:ascii="Arial" w:hAnsi="Arial" w:cs="Arial"/>
+          <w:b/>
+          <w:bCs/>
+        </w:rPr>
+        <w:t>{{FECHA_NOMBRAMIENTO}}</w:t>
+      </w:r>
+      <w:r>
+        <w:rPr>
+          <w:rFonts w:ascii="Arial" w:hAnsi="Arial" w:cs="Arial"/>
+          <w:b/>
+          <w:bCs/>
+        </w:rPr>
+        <w:t xml:space="preserve">, </w:t>
+      </w:r>
+      <w:r>
+        <w:rPr>
+          <w:rFonts w:ascii="Arial" w:hAnsi="Arial" w:cs="Arial"/>
+        </w:rPr>
+        <w:t xml:space="preserve">se extiende el presente </w:t>
+      </w:r>
+      <w:r>
+        <w:rPr>
+          <w:rFonts w:ascii="Arial" w:hAnsi="Arial" w:cs="Arial"/>
+          <w:b/>
+          <w:bCs/>
+        </w:rPr>
+        <w:t>nombramiento</w:t>
+      </w:r>
+      <w:r>
+        <w:rPr>
+          <w:rFonts w:ascii="Arial" w:hAnsi="Arial" w:cs="Arial"/>
+          <w:b/>
+          <w:bCs/>
+        </w:rPr>
+        <w:t xml:space="preserve"> de comisión</w:t>
+      </w:r>
+      <w:r>
+        <w:rPr>
+          <w:rFonts w:ascii="Arial" w:hAnsi="Arial" w:cs="Arial"/>
+        </w:rPr>
+        <w:t xml:space="preserve"> a favor de</w:t>
+      </w:r>
+      <w:r>
+        <w:rPr>
+          <w:rFonts w:ascii="Arial" w:hAnsi="Arial" w:cs="Arial"/>
+        </w:rPr>
+        <w:t>:</w:t>
+      </w:r>
+      <w:r>
+        <w:rPr>
+          <w:rFonts w:ascii="Arial" w:hAnsi="Arial" w:cs="Arial"/>
+        </w:rPr>
+        <w:t xml:space="preserve"> </w:t>
+      </w:r>
+      <w:r>
+        <w:rPr>
+          <w:rFonts w:ascii="Arial" w:hAnsi="Arial" w:cs="Arial"/>
+          <w:b/>
+          <w:bCs/>
+        </w:rPr>
+        <w:t>{{NOMBRE_USUARIO}}</w:t>
+      </w:r>
+      <w:r>
+        <w:rPr>
+          <w:rFonts w:ascii="Arial" w:hAnsi="Arial" w:cs="Arial"/>
+        </w:rPr>
+        <w:t xml:space="preserve">, </w:t>
+      </w:r>
+      <w:r>
+        <w:rPr>
+          <w:rFonts w:ascii="Arial" w:hAnsi="Arial" w:cs="Arial"/>
+        </w:rPr>
+        <w:t>quien desempeña el cargo de</w:t>
+      </w:r>
+      <w:r>
+        <w:rPr>
+          <w:rFonts w:ascii="Arial" w:hAnsi="Arial" w:cs="Arial"/>
+        </w:rPr>
+        <w:t>:</w:t>
+      </w:r>
+      <w:r>
+        <w:rPr>
+          <w:rFonts w:ascii="Arial" w:hAnsi="Arial" w:cs="Arial"/>
+        </w:rPr>
+        <w:t xml:space="preserve"> </w:t>
+      </w:r>
+      <w:r>
+        <w:rPr>
+          <w:rFonts w:ascii="Arial" w:hAnsi="Arial" w:cs="Arial"/>
+          <w:b/>
+          <w:bCs/>
+        </w:rPr>
+        <w:t>{{PUESTO}}</w:t>
+      </w:r>
+      <w:r>
+        <w:rPr>
+          <w:rFonts w:ascii="Arial" w:hAnsi="Arial" w:cs="Arial"/>
+        </w:rPr>
+        <w:t>.</w:t>
+      </w:r>
+    </w:p>
+    <w:p>
+      <w:pPr>
+        <w:spacing w:line="276" w:lineRule="auto"/>
+        <w:jc w:val="both"/>
+        <w:rPr>
+          <w:rFonts w:ascii="Arial" w:hAnsi="Arial" w:cs="Arial"/>
+        </w:rPr>
+      </w:pPr>
+    </w:p>
+    <w:p>
+      <w:pPr>
+        <w:spacing w:line="276" w:lineRule="auto"/>
+        <w:jc w:val="both"/>
+        <w:rPr>
+          <w:rFonts w:ascii="Arial" w:hAnsi="Arial" w:cs="Arial"/>
+        </w:rPr>
+      </w:pPr>
+      <w:r>
+        <w:rPr>
+          <w:rFonts w:ascii="Arial" w:hAnsi="Arial" w:cs="Arial"/>
+        </w:rPr>
+        <w:t>Por este medio, se le informa que ha sido designado para realizar la comisión</w:t>
+      </w:r>
+      <w:r>
+        <w:rPr>
+          <w:rFonts w:ascii="Arial" w:hAnsi="Arial" w:cs="Arial"/>
+        </w:rPr>
+        <w:t xml:space="preserve"> </w:t>
+      </w:r>
+      <w:r>
+        <w:rPr>
+          <w:rFonts w:ascii="Arial" w:hAnsi="Arial" w:cs="Arial"/>
+        </w:rPr>
+        <w:t xml:space="preserve">con el propósito </w:t>
+      </w:r>
+      <w:r>
+        <w:rPr>
+          <w:rFonts w:ascii="Arial" w:hAnsi="Arial" w:cs="Arial"/>
+        </w:rPr>
+        <w:t>de:</w:t>
+      </w:r>
+    </w:p>
+    <w:p>
+      <w:pPr>
+        <w:spacing w:line="276" w:lineRule="auto"/>
+        <w:jc w:val="both"/>
+        <w:rPr>
+          <w:rFonts w:ascii="Arial" w:hAnsi="Arial" w:cs="Arial"/>
+        </w:rPr>
+      </w:pPr>
+    </w:p>
+    <w:p>
+      <w:pPr>
+        <w:spacing w:line="276" w:lineRule="auto"/>
+        <w:jc w:val="both"/>
+        <w:rPr>
+          <w:rFonts w:ascii="Arial" w:hAnsi="Arial" w:cs="Arial"/>
+          <w:b/>
+          <w:bCs/>
+        </w:rPr>
+      </w:pPr>
+      <w:r>
+        <w:rPr>
+          <w:rFonts w:ascii="Arial" w:hAnsi="Arial" w:cs="Arial"/>
+          <w:b/>
+          <w:bCs/>
+        </w:rPr>
+        <w:t>{{PROPOSITO}}</w:t>
+      </w:r>
+    </w:p>
+    <w:p>
+      <w:pPr>
+        <w:spacing w:line="276" w:lineRule="auto"/>
+        <w:jc w:val="both"/>
+        <w:rPr>
+          <w:rFonts w:ascii="Arial" w:hAnsi="Arial" w:cs="Arial"/>
+        </w:rPr>
+      </w:pPr>
+    </w:p>
+    <w:p>
+      <w:pPr>
+        <w:spacing w:line="276" w:lineRule="auto"/>
+        <w:jc w:val="both"/>
+        <w:rPr>
+          <w:rFonts w:ascii="Arial" w:hAnsi="Arial" w:cs="Arial"/>
+        </w:rPr>
+      </w:pPr>
+      <w:r>
+        <w:rPr>
+          <w:rFonts w:ascii="Arial" w:hAnsi="Arial" w:cs="Arial"/>
+        </w:rPr>
+        <w:t>Realizar</w:t>
+      </w:r>
+      <w:r>
+        <w:rPr>
+          <w:rFonts w:ascii="Arial" w:hAnsi="Arial" w:cs="Arial"/>
+        </w:rPr>
+        <w:t xml:space="preserve"> las diligencias que corresponden en cuanto a la designación y los procesos requeridos, en </w:t>
+      </w:r>
+      <w:r>
+        <w:rPr>
+          <w:rFonts w:ascii="Arial" w:hAnsi="Arial" w:cs="Arial"/>
+        </w:rPr>
+        <w:t xml:space="preserve">el/los departamento(s) </w:t>
+      </w:r>
+      <w:r>
+        <w:rPr>
+          <w:rFonts w:ascii="Arial" w:hAnsi="Arial" w:cs="Arial"/>
+        </w:rPr>
+        <w:t>de</w:t>
+      </w:r>
+      <w:r>
+        <w:rPr>
+          <w:rFonts w:ascii="Arial" w:hAnsi="Arial" w:cs="Arial"/>
+        </w:rPr>
+        <w:t>:</w:t>
+      </w:r>
+    </w:p>
+    <w:p>
+      <w:pPr>
+        <w:spacing w:line="276" w:lineRule="auto"/>
+        <w:jc w:val="both"/>
+        <w:rPr>
+          <w:rFonts w:ascii="Arial" w:hAnsi="Arial" w:cs="Arial"/>
+        </w:rPr>
+      </w:pPr>
+    </w:p>
+    <w:p>
+      <w:pPr>
+        <w:spacing w:line="276" w:lineRule="auto"/>
+        <w:jc w:val="both"/>
+        <w:rPr>
+          <w:rFonts w:ascii="Arial" w:hAnsi="Arial" w:cs="Arial"/>
+          <w:b/>
+          <w:bCs/>
+        </w:rPr>
+      </w:pPr>
+      <w:r>
+        <w:rPr>
+          <w:rFonts w:ascii="Arial" w:hAnsi="Arial" w:cs="Arial"/>
+          <w:b/>
+          <w:bCs/>
+        </w:rPr>
+        <w:t>{{DESTINOS}}</w:t>
+      </w:r>
+    </w:p>
+    <w:p>
+      <w:pPr>
+        <w:spacing w:line="276" w:lineRule="auto"/>
+        <w:jc w:val="both"/>
+        <w:rPr>
+          <w:rFonts w:ascii="Arial" w:hAnsi="Arial" w:cs="Arial"/>
+        </w:rPr>
+      </w:pPr>
+    </w:p>
+    <w:p>
+      <w:pPr>
+        <w:spacing w:line="276" w:lineRule="auto"/>
+        <w:jc w:val="both"/>
+        <w:rPr>
+          <w:rFonts w:ascii="Arial" w:hAnsi="Arial" w:cs="Arial"/>
+        </w:rPr>
+      </w:pPr>
+      <w:r>
+        <w:rPr>
+          <w:rFonts w:ascii="Arial" w:hAnsi="Arial" w:cs="Arial"/>
+        </w:rPr>
+        <w:t>La vigencia de la comisión será</w:t>
+      </w:r>
+      <w:r>
+        <w:rPr>
+          <w:rFonts w:ascii="Arial" w:hAnsi="Arial" w:cs="Arial"/>
+        </w:rPr>
+        <w:t xml:space="preserve"> </w:t>
+      </w:r>
+      <w:r>
+        <w:rPr>
+          <w:rFonts w:ascii="Arial" w:hAnsi="Arial" w:cs="Arial"/>
+        </w:rPr>
+        <w:t>del</w:t>
+      </w:r>
+      <w:r>
+        <w:rPr>
+          <w:rFonts w:ascii="Arial" w:hAnsi="Arial" w:cs="Arial"/>
+        </w:rPr>
+        <w:t xml:space="preserve">: </w:t>
+      </w:r>
+      <w:r>
+        <w:rPr>
+          <w:rFonts w:ascii="Arial" w:hAnsi="Arial" w:cs="Arial"/>
+          <w:b/>
+          <w:bCs/>
+        </w:rPr>
+        <w:t xml:space="preserve">{{FECHA_SALIDA}} </w:t>
+      </w:r>
+      <w:r>
+        <w:rPr>
+          <w:rFonts w:ascii="Arial" w:hAnsi="Arial" w:cs="Arial"/>
+        </w:rPr>
+        <w:t>al</w:t>
+      </w:r>
+      <w:r>
+        <w:rPr>
+          <w:rFonts w:ascii="Arial" w:hAnsi="Arial" w:cs="Arial"/>
+        </w:rPr>
+        <w:t xml:space="preserve">: </w:t>
+      </w:r>
+      <w:r>
+        <w:rPr>
+          <w:rFonts w:ascii="Arial" w:hAnsi="Arial" w:cs="Arial"/>
+          <w:b/>
+          <w:bCs/>
+        </w:rPr>
+        <w:t>{{FECHA_REGRESO}}</w:t>
+      </w:r>
+      <w:r>
+        <w:rPr>
+          <w:rFonts w:ascii="Arial" w:hAnsi="Arial" w:cs="Arial"/>
+        </w:rPr>
+        <w:t>.</w:t>
+      </w:r>
+      <w:r>
+        <w:rPr>
+          <w:rFonts w:ascii="Arial" w:hAnsi="Arial" w:cs="Arial"/>
+        </w:rPr>
+        <w:t xml:space="preserve"> </w:t>
+      </w:r>
+      <w:r>
+        <w:rPr>
+          <w:rFonts w:ascii="Arial" w:hAnsi="Arial" w:cs="Arial"/>
+        </w:rPr>
+        <w:t>Deberá</w:t>
+      </w:r>
+      <w:r>
+        <w:rPr>
+          <w:rFonts w:ascii="Arial" w:hAnsi="Arial" w:cs="Arial"/>
+        </w:rPr>
+        <w:t xml:space="preserve"> </w:t>
+      </w:r>
+      <w:r>
+        <w:rPr>
+          <w:rFonts w:ascii="Arial" w:hAnsi="Arial" w:cs="Arial"/>
+        </w:rPr>
+        <w:t xml:space="preserve">presentar los informes </w:t>
+      </w:r>
+      <w:r>
+        <w:rPr>
+          <w:rFonts w:ascii="Arial" w:hAnsi="Arial" w:cs="Arial"/>
+        </w:rPr>
+        <w:t>correspondientes</w:t>
+      </w:r>
+      <w:r>
+        <w:rPr>
+          <w:rFonts w:ascii="Arial" w:hAnsi="Arial" w:cs="Arial"/>
+        </w:rPr>
+        <w:t xml:space="preserve"> al concluir la actividad</w:t>
+      </w:r>
+      <w:r>
+        <w:rPr>
+          <w:rFonts w:ascii="Arial" w:hAnsi="Arial" w:cs="Arial"/>
+        </w:rPr>
+        <w:t>.</w:t>
       </w:r>
     </w:p>
     <w:p>

</xml_diff>